<commit_message>
Button Popsounds, Improved Animations, Settings Panel
</commit_message>
<xml_diff>
--- a/Documentation.docx
+++ b/Documentation.docx
@@ -4380,6 +4380,133 @@
           <w14:ligatures w14:val="none"/>
         </w:rPr>
         <w:t>Alles danach ist Erweiterung.</w:t>
+      </w:r>
+    </w:p>
+    <w:p/>
+    <w:p/>
+    <w:p/>
+    <w:p/>
+    <w:p/>
+    <w:p/>
+    <w:p>
+      <w:proofErr w:type="spellStart"/>
+      <w:r>
+        <w:t>TrungAufgabe</w:t>
+      </w:r>
+      <w:proofErr w:type="spellEnd"/>
+      <w:r>
+        <w:t>:</w:t>
+      </w:r>
+    </w:p>
+    <w:p>
+      <w:r>
+        <w:t xml:space="preserve">Wenn Spieler nah an einem </w:t>
+      </w:r>
+      <w:proofErr w:type="spellStart"/>
+      <w:r>
+        <w:t>object</w:t>
+      </w:r>
+      <w:proofErr w:type="spellEnd"/>
+      <w:r>
+        <w:t xml:space="preserve"> mit Tag „Placeholder1“ </w:t>
+      </w:r>
+      <w:proofErr w:type="spellStart"/>
+      <w:r>
+        <w:t>then</w:t>
+      </w:r>
+      <w:proofErr w:type="spellEnd"/>
+      <w:r>
+        <w:t xml:space="preserve"> „placeholderText1“ </w:t>
+      </w:r>
+      <w:proofErr w:type="spellStart"/>
+      <w:r>
+        <w:t>setActive</w:t>
+      </w:r>
+      <w:proofErr w:type="spellEnd"/>
+      <w:r>
+        <w:t>.</w:t>
+      </w:r>
+    </w:p>
+    <w:p>
+      <w:r>
+        <w:t xml:space="preserve">Wenn Spieler nah an einem </w:t>
+      </w:r>
+      <w:proofErr w:type="spellStart"/>
+      <w:r>
+        <w:t>object</w:t>
+      </w:r>
+      <w:proofErr w:type="spellEnd"/>
+      <w:r>
+        <w:t xml:space="preserve"> mit Tag „Placeholder</w:t>
+      </w:r>
+      <w:r>
+        <w:t>2</w:t>
+      </w:r>
+      <w:r>
+        <w:t xml:space="preserve">“ </w:t>
+      </w:r>
+      <w:proofErr w:type="spellStart"/>
+      <w:r>
+        <w:t>then</w:t>
+      </w:r>
+      <w:proofErr w:type="spellEnd"/>
+      <w:r>
+        <w:t xml:space="preserve"> „placeholderText</w:t>
+      </w:r>
+      <w:r>
+        <w:t>2</w:t>
+      </w:r>
+      <w:r>
+        <w:t xml:space="preserve">“ </w:t>
+      </w:r>
+      <w:proofErr w:type="spellStart"/>
+      <w:r>
+        <w:t>setActive</w:t>
+      </w:r>
+      <w:proofErr w:type="spellEnd"/>
+      <w:r>
+        <w:t>.</w:t>
+      </w:r>
+    </w:p>
+    <w:p>
+      <w:r>
+        <w:t xml:space="preserve">Wenn Spieler nah an einem </w:t>
+      </w:r>
+      <w:proofErr w:type="spellStart"/>
+      <w:r>
+        <w:t>object</w:t>
+      </w:r>
+      <w:proofErr w:type="spellEnd"/>
+      <w:r>
+        <w:t xml:space="preserve"> mit Tag „Placeholder</w:t>
+      </w:r>
+      <w:r>
+        <w:t>3</w:t>
+      </w:r>
+      <w:r>
+        <w:t xml:space="preserve">“ </w:t>
+      </w:r>
+      <w:proofErr w:type="spellStart"/>
+      <w:r>
+        <w:t>then</w:t>
+      </w:r>
+      <w:proofErr w:type="spellEnd"/>
+      <w:r>
+        <w:t xml:space="preserve"> „placeholderText</w:t>
+      </w:r>
+      <w:r>
+        <w:t>3</w:t>
+      </w:r>
+      <w:r>
+        <w:t xml:space="preserve">“ </w:t>
+      </w:r>
+      <w:proofErr w:type="spellStart"/>
+      <w:r>
+        <w:t>setActive</w:t>
+      </w:r>
+      <w:proofErr w:type="spellEnd"/>
+      <w:r>
+        <w:t>.</w:t>
       </w:r>
     </w:p>
     <w:p/>
@@ -5913,6 +6040,7 @@
   <w:style w:type="character" w:default="1" w:styleId="DefaultParagraphFont">
     <w:name w:val="Default Paragraph Font"/>
     <w:uiPriority w:val="1"/>
+    <w:semiHidden/>
     <w:unhideWhenUsed/>
   </w:style>
   <w:style w:type="table" w:default="1" w:styleId="TableNormal">

</xml_diff>